<commit_message>
Syncing local files with GitHub data
</commit_message>
<xml_diff>
--- a/Lab/Lab11/TaskLab1125P0011_MUhammadAwais_BAI2A.docx
+++ b/Lab/Lab11/TaskLab1125P0011_MUhammadAwais_BAI2A.docx
@@ -50,16 +50,10 @@
     </w:p>
     <w:p>
       <w:pPr>
-        <w:rPr>
-          <w:rFonts w:ascii="Times New Roman" w:hAnsi="Times New Roman"/>
-        </w:rPr>
-      </w:pPr>
-    </w:p>
-    <w:p>
-      <w:pPr>
         <w:jc w:val="center"/>
         <w:rPr>
           <w:rFonts w:ascii="Times New Roman" w:hAnsi="Times New Roman"/>
+          <w:noProof/>
         </w:rPr>
       </w:pPr>
       <w:r>
@@ -68,7 +62,7 @@
           <w:noProof/>
         </w:rPr>
         <w:drawing>
-          <wp:inline distT="0" distB="0" distL="0" distR="0" wp14:anchorId="6E1A1274" wp14:editId="7C78FC64">
+          <wp:inline distT="0" distB="0" distL="0" distR="0" wp14:anchorId="55744410" wp14:editId="6EC8DA5B">
             <wp:extent cx="6645910" cy="3756660"/>
             <wp:effectExtent l="0" t="0" r="2540" b="0"/>
             <wp:docPr id="1" name="Picture 1"/>
@@ -90,6 +84,98 @@
                         </a:ext>
                       </a:extLst>
                     </a:blip>
+                    <a:stretch>
+                      <a:fillRect/>
+                    </a:stretch>
+                  </pic:blipFill>
+                  <pic:spPr>
+                    <a:xfrm>
+                      <a:off x="0" y="0"/>
+                      <a:ext cx="6645910" cy="3756660"/>
+                    </a:xfrm>
+                    <a:prstGeom prst="rect">
+                      <a:avLst/>
+                    </a:prstGeom>
+                  </pic:spPr>
+                </pic:pic>
+              </a:graphicData>
+            </a:graphic>
+          </wp:inline>
+        </w:drawing>
+      </w:r>
+      <w:r>
+        <w:rPr>
+          <w:rFonts w:ascii="Times New Roman" w:hAnsi="Times New Roman"/>
+          <w:noProof/>
+        </w:rPr>
+        <w:t xml:space="preserve"> </w:t>
+      </w:r>
+    </w:p>
+    <w:p>
+      <w:pPr>
+        <w:pStyle w:val="Heading2"/>
+        <w:rPr>
+          <w:rFonts w:ascii="Times New Roman" w:hAnsi="Times New Roman"/>
+          <w:b/>
+          <w:bCs/>
+          <w:color w:val="auto"/>
+        </w:rPr>
+      </w:pPr>
+      <w:r>
+        <w:rPr>
+          <w:rFonts w:ascii="Times New Roman" w:hAnsi="Times New Roman"/>
+          <w:b/>
+          <w:bCs/>
+          <w:color w:val="auto"/>
+        </w:rPr>
+        <w:t xml:space="preserve">Lab </w:t>
+      </w:r>
+      <w:r>
+        <w:rPr>
+          <w:rFonts w:ascii="Times New Roman" w:hAnsi="Times New Roman"/>
+          <w:b/>
+          <w:bCs/>
+          <w:color w:val="auto"/>
+        </w:rPr>
+        <w:t>Code</w:t>
+      </w:r>
+      <w:r>
+        <w:rPr>
+          <w:rFonts w:ascii="Times New Roman" w:hAnsi="Times New Roman"/>
+          <w:b/>
+          <w:bCs/>
+          <w:color w:val="auto"/>
+        </w:rPr>
+        <w:t>:</w:t>
+      </w:r>
+    </w:p>
+    <w:p>
+      <w:pPr>
+        <w:rPr>
+          <w:rFonts w:ascii="Times New Roman" w:hAnsi="Times New Roman"/>
+        </w:rPr>
+      </w:pPr>
+      <w:r>
+        <w:rPr>
+          <w:noProof/>
+        </w:rPr>
+        <w:drawing>
+          <wp:inline distT="0" distB="0" distL="0" distR="0" wp14:anchorId="53FC1378" wp14:editId="494B87D0">
+            <wp:extent cx="6645910" cy="3756660"/>
+            <wp:effectExtent l="0" t="0" r="2540" b="0"/>
+            <wp:docPr id="2" name="Picture 2"/>
+            <wp:cNvGraphicFramePr>
+              <a:graphicFrameLocks xmlns:a="http://schemas.openxmlformats.org/drawingml/2006/main" noChangeAspect="1"/>
+            </wp:cNvGraphicFramePr>
+            <a:graphic xmlns:a="http://schemas.openxmlformats.org/drawingml/2006/main">
+              <a:graphicData uri="http://schemas.openxmlformats.org/drawingml/2006/picture">
+                <pic:pic xmlns:pic="http://schemas.openxmlformats.org/drawingml/2006/picture">
+                  <pic:nvPicPr>
+                    <pic:cNvPr id="1" name=""/>
+                    <pic:cNvPicPr/>
+                  </pic:nvPicPr>
+                  <pic:blipFill>
+                    <a:blip r:embed="rId5"/>
                     <a:stretch>
                       <a:fillRect/>
                     </a:stretch>

</xml_diff>